<commit_message>
fix(hogar): alinear formato de comparativo hogar con slip manual (logos, deducibles, coberturas y layout)
</commit_message>
<xml_diff>
--- a/assets/layouts/Hogar.docx
+++ b/assets/layouts/Hogar.docx
@@ -2106,12 +2106,27 @@
                 <w:rFonts w:ascii="Aptos" w:hAnsi="Aptos"/>
               </w:rPr>
             </w:pPr>
+            <w:r>
+              <w:t>Hurto Calificado</w:t>
+            </w:r>
+          </w:p>
+        </w:tc>
+        <w:tc>
+          <w:tcPr>
+            <w:tcW w:w="1872" w:type="dxa"/>
+          </w:tcPr>
+          <w:p>
+            <w:pPr>
+              <w:rPr>
+                <w:rFonts w:ascii="Aptos" w:hAnsi="Aptos"/>
+              </w:rPr>
+            </w:pPr>
             <w:proofErr w:type="spellStart"/>
             <w:r>
               <w:rPr>
                 <w:rFonts w:ascii="Aptos" w:hAnsi="Aptos"/>
               </w:rPr>
-              <w:t>Hurto</w:t>
+              <w:t>Equipos</w:t>
             </w:r>
             <w:proofErr w:type="spellEnd"/>
             <w:r>
@@ -2125,28 +2140,233 @@
               <w:rPr>
                 <w:rFonts w:ascii="Aptos" w:hAnsi="Aptos"/>
               </w:rPr>
-              <w:t>Calificado</w:t>
+              <w:t>electrónicos</w:t>
+            </w:r>
+            <w:proofErr w:type="spellEnd"/>
+          </w:p>
+        </w:tc>
+        <w:tc>
+          <w:tcPr>
+            <w:tcW w:w="1872" w:type="dxa"/>
+          </w:tcPr>
+          <w:p>
+            <w:pPr>
+              <w:jc w:val="center"/>
+              <w:rPr>
+                <w:rFonts w:ascii="Aptos" w:hAnsi="Aptos"/>
+              </w:rPr>
+            </w:pPr>
+          </w:p>
+        </w:tc>
+        <w:tc>
+          <w:tcPr>
+            <w:tcW w:w="1872" w:type="dxa"/>
+          </w:tcPr>
+          <w:p>
+            <w:pPr>
+              <w:jc w:val="center"/>
+              <w:rPr>
+                <w:rFonts w:ascii="Aptos" w:hAnsi="Aptos"/>
+              </w:rPr>
+            </w:pPr>
+          </w:p>
+        </w:tc>
+        <w:tc>
+          <w:tcPr>
+            <w:tcW w:w="1872" w:type="dxa"/>
+          </w:tcPr>
+          <w:p>
+            <w:pPr>
+              <w:jc w:val="center"/>
+              <w:rPr>
+                <w:rFonts w:ascii="Aptos" w:hAnsi="Aptos"/>
+              </w:rPr>
+            </w:pPr>
+          </w:p>
+        </w:tc>
+      </w:tr>
+      <w:tr>
+        <w:tc>
+          <w:tcPr>
+            <w:tcW w:w="1872" w:type="dxa"/>
+            <w:vMerge/>
+          </w:tcPr>
+          <w:p>
+            <w:pPr>
+              <w:rPr>
+                <w:rFonts w:ascii="Aptos" w:hAnsi="Aptos"/>
+              </w:rPr>
+            </w:pPr>
+          </w:p>
+        </w:tc>
+        <w:tc>
+          <w:tcPr>
+            <w:tcW w:w="1872" w:type="dxa"/>
+          </w:tcPr>
+          <w:p>
+            <w:pPr>
+              <w:rPr>
+                <w:rFonts w:ascii="Aptos" w:hAnsi="Aptos"/>
+              </w:rPr>
+            </w:pPr>
+            <w:proofErr w:type="spellStart"/>
+            <w:r>
+              <w:rPr>
+                <w:rFonts w:ascii="Aptos" w:hAnsi="Aptos"/>
+              </w:rPr>
+              <w:t>Muebles</w:t>
             </w:r>
             <w:proofErr w:type="spellEnd"/>
             <w:r>
               <w:rPr>
                 <w:rFonts w:ascii="Aptos" w:hAnsi="Aptos"/>
               </w:rPr>
-              <w:t xml:space="preserve"> / </w:t>
+              <w:t xml:space="preserve"> y </w:t>
             </w:r>
             <w:proofErr w:type="spellStart"/>
             <w:r>
               <w:rPr>
                 <w:rFonts w:ascii="Aptos" w:hAnsi="Aptos"/>
               </w:rPr>
-              <w:t>Hurto</w:t>
+              <w:t>enceres</w:t>
             </w:r>
             <w:proofErr w:type="spellEnd"/>
+          </w:p>
+        </w:tc>
+        <w:tc>
+          <w:tcPr>
+            <w:tcW w:w="1872" w:type="dxa"/>
+          </w:tcPr>
+          <w:p>
+            <w:pPr>
+              <w:jc w:val="center"/>
+              <w:rPr>
+                <w:rFonts w:ascii="Aptos" w:hAnsi="Aptos"/>
+              </w:rPr>
+            </w:pPr>
+          </w:p>
+        </w:tc>
+        <w:tc>
+          <w:tcPr>
+            <w:tcW w:w="1872" w:type="dxa"/>
+          </w:tcPr>
+          <w:p>
+            <w:pPr>
+              <w:jc w:val="center"/>
+              <w:rPr>
+                <w:rFonts w:ascii="Aptos" w:hAnsi="Aptos"/>
+              </w:rPr>
+            </w:pPr>
+          </w:p>
+        </w:tc>
+        <w:tc>
+          <w:tcPr>
+            <w:tcW w:w="1872" w:type="dxa"/>
+          </w:tcPr>
+          <w:p>
+            <w:pPr>
+              <w:jc w:val="center"/>
+              <w:rPr>
+                <w:rFonts w:ascii="Aptos" w:hAnsi="Aptos"/>
+              </w:rPr>
+            </w:pPr>
+          </w:p>
+        </w:tc>
+      </w:tr>
+      <w:tr>
+        <w:tc>
+          <w:tcPr>
+            <w:tcW w:w="1872" w:type="dxa"/>
+            <w:vMerge/>
+          </w:tcPr>
+          <w:p>
+            <w:pPr>
+              <w:rPr>
+                <w:rFonts w:ascii="Aptos" w:hAnsi="Aptos"/>
+              </w:rPr>
+            </w:pPr>
+          </w:p>
+        </w:tc>
+        <w:tc>
+          <w:tcPr>
+            <w:tcW w:w="1872" w:type="dxa"/>
+          </w:tcPr>
+          <w:p>
+            <w:pPr>
+              <w:rPr>
+                <w:rFonts w:ascii="Aptos" w:hAnsi="Aptos"/>
+              </w:rPr>
+            </w:pPr>
             <w:r>
               <w:rPr>
                 <w:rFonts w:ascii="Aptos" w:hAnsi="Aptos"/>
               </w:rPr>
-              <w:t xml:space="preserve"> Simple</w:t>
+              <w:t xml:space="preserve">Obras de </w:t>
+            </w:r>
+            <w:proofErr w:type="spellStart"/>
+            <w:r>
+              <w:rPr>
+                <w:rFonts w:ascii="Aptos" w:hAnsi="Aptos"/>
+              </w:rPr>
+              <w:t>arte</w:t>
+            </w:r>
+            <w:proofErr w:type="spellEnd"/>
+          </w:p>
+        </w:tc>
+        <w:tc>
+          <w:tcPr>
+            <w:tcW w:w="1872" w:type="dxa"/>
+          </w:tcPr>
+          <w:p>
+            <w:pPr>
+              <w:jc w:val="center"/>
+              <w:rPr>
+                <w:rFonts w:ascii="Aptos" w:hAnsi="Aptos"/>
+              </w:rPr>
+            </w:pPr>
+          </w:p>
+        </w:tc>
+        <w:tc>
+          <w:tcPr>
+            <w:tcW w:w="1872" w:type="dxa"/>
+          </w:tcPr>
+          <w:p>
+            <w:pPr>
+              <w:jc w:val="center"/>
+              <w:rPr>
+                <w:rFonts w:ascii="Aptos" w:hAnsi="Aptos"/>
+              </w:rPr>
+            </w:pPr>
+          </w:p>
+        </w:tc>
+        <w:tc>
+          <w:tcPr>
+            <w:tcW w:w="1872" w:type="dxa"/>
+          </w:tcPr>
+          <w:p>
+            <w:pPr>
+              <w:jc w:val="center"/>
+              <w:rPr>
+                <w:rFonts w:ascii="Aptos" w:hAnsi="Aptos"/>
+              </w:rPr>
+            </w:pPr>
+          </w:p>
+        </w:tc>
+      </w:tr>
+      <w:tr>
+        <w:tc>
+          <w:tcPr>
+            <w:tcW w:w="1872" w:type="dxa"/>
+            <w:vMerge w:val="restart"/>
+          </w:tcPr>
+          <w:p>
+            <w:pPr>
+              <w:rPr>
+                <w:rFonts w:ascii="Aptos" w:hAnsi="Aptos"/>
+              </w:rPr>
+            </w:pPr>
+            <w:r>
+              <w:t>Hurto Simple</w:t>
             </w:r>
           </w:p>
         </w:tc>
@@ -2195,6 +2415,7 @@
                 <w:rFonts w:ascii="Aptos" w:hAnsi="Aptos"/>
               </w:rPr>
             </w:pPr>
+            <w:r/>
           </w:p>
         </w:tc>
         <w:tc>
@@ -2208,6 +2429,7 @@
                 <w:rFonts w:ascii="Aptos" w:hAnsi="Aptos"/>
               </w:rPr>
             </w:pPr>
+            <w:r/>
           </w:p>
         </w:tc>
         <w:tc>
@@ -2221,6 +2443,7 @@
                 <w:rFonts w:ascii="Aptos" w:hAnsi="Aptos"/>
               </w:rPr>
             </w:pPr>
+            <w:r/>
           </w:p>
         </w:tc>
       </w:tr>
@@ -2283,6 +2506,7 @@
                 <w:rFonts w:ascii="Aptos" w:hAnsi="Aptos"/>
               </w:rPr>
             </w:pPr>
+            <w:r/>
           </w:p>
         </w:tc>
         <w:tc>
@@ -2296,6 +2520,7 @@
                 <w:rFonts w:ascii="Aptos" w:hAnsi="Aptos"/>
               </w:rPr>
             </w:pPr>
+            <w:r/>
           </w:p>
         </w:tc>
         <w:tc>
@@ -2309,6 +2534,7 @@
                 <w:rFonts w:ascii="Aptos" w:hAnsi="Aptos"/>
               </w:rPr>
             </w:pPr>
+            <w:r/>
           </w:p>
         </w:tc>
       </w:tr>
@@ -2363,6 +2589,7 @@
                 <w:rFonts w:ascii="Aptos" w:hAnsi="Aptos"/>
               </w:rPr>
             </w:pPr>
+            <w:r/>
           </w:p>
         </w:tc>
         <w:tc>
@@ -2376,6 +2603,7 @@
                 <w:rFonts w:ascii="Aptos" w:hAnsi="Aptos"/>
               </w:rPr>
             </w:pPr>
+            <w:r/>
           </w:p>
         </w:tc>
         <w:tc>
@@ -2389,6 +2617,7 @@
                 <w:rFonts w:ascii="Aptos" w:hAnsi="Aptos"/>
               </w:rPr>
             </w:pPr>
+            <w:r/>
           </w:p>
         </w:tc>
       </w:tr>
@@ -3021,11 +3250,67 @@
               </w:rPr>
             </w:pPr>
             <w:r>
+              <w:t>Hurto Calificado</w:t>
+            </w:r>
+          </w:p>
+        </w:tc>
+        <w:tc>
+          <w:tcPr>
+            <w:tcW w:w="2340" w:type="dxa"/>
+          </w:tcPr>
+          <w:p>
+            <w:pPr>
+              <w:jc w:val="center"/>
               <w:rPr>
                 <w:rFonts w:ascii="Aptos" w:hAnsi="Aptos"/>
                 <w:lang w:val="es-CO"/>
               </w:rPr>
-              <w:t>Hurto Calificado / Hurto Simple / Otras coberturas</w:t>
+            </w:pPr>
+          </w:p>
+        </w:tc>
+        <w:tc>
+          <w:tcPr>
+            <w:tcW w:w="2340" w:type="dxa"/>
+          </w:tcPr>
+          <w:p>
+            <w:pPr>
+              <w:jc w:val="center"/>
+              <w:rPr>
+                <w:rFonts w:ascii="Aptos" w:hAnsi="Aptos"/>
+                <w:lang w:val="es-CO"/>
+              </w:rPr>
+            </w:pPr>
+          </w:p>
+        </w:tc>
+        <w:tc>
+          <w:tcPr>
+            <w:tcW w:w="2340" w:type="dxa"/>
+          </w:tcPr>
+          <w:p>
+            <w:pPr>
+              <w:jc w:val="center"/>
+              <w:rPr>
+                <w:rFonts w:ascii="Aptos" w:hAnsi="Aptos"/>
+                <w:lang w:val="es-CO"/>
+              </w:rPr>
+            </w:pPr>
+          </w:p>
+        </w:tc>
+      </w:tr>
+      <w:tr>
+        <w:tc>
+          <w:tcPr>
+            <w:tcW w:w="2340" w:type="dxa"/>
+          </w:tcPr>
+          <w:p>
+            <w:pPr>
+              <w:rPr>
+                <w:rFonts w:ascii="Aptos" w:hAnsi="Aptos"/>
+                <w:lang w:val="es-CO"/>
+              </w:rPr>
+            </w:pPr>
+            <w:r>
+              <w:t>Hurto Simple</w:t>
             </w:r>
           </w:p>
         </w:tc>
@@ -3041,6 +3326,7 @@
                 <w:lang w:val="es-CO"/>
               </w:rPr>
             </w:pPr>
+            <w:r/>
           </w:p>
         </w:tc>
         <w:tc>
@@ -3055,6 +3341,7 @@
                 <w:lang w:val="es-CO"/>
               </w:rPr>
             </w:pPr>
+            <w:r/>
           </w:p>
         </w:tc>
         <w:tc>
@@ -3069,6 +3356,70 @@
                 <w:lang w:val="es-CO"/>
               </w:rPr>
             </w:pPr>
+            <w:r/>
+          </w:p>
+        </w:tc>
+      </w:tr>
+      <w:tr>
+        <w:tc>
+          <w:tcPr>
+            <w:tcW w:w="2340" w:type="dxa"/>
+          </w:tcPr>
+          <w:p>
+            <w:pPr>
+              <w:rPr>
+                <w:rFonts w:ascii="Aptos" w:hAnsi="Aptos"/>
+                <w:lang w:val="es-CO"/>
+              </w:rPr>
+            </w:pPr>
+            <w:r>
+              <w:t>Otras coberturas</w:t>
+            </w:r>
+          </w:p>
+        </w:tc>
+        <w:tc>
+          <w:tcPr>
+            <w:tcW w:w="2340" w:type="dxa"/>
+          </w:tcPr>
+          <w:p>
+            <w:pPr>
+              <w:jc w:val="center"/>
+              <w:rPr>
+                <w:rFonts w:ascii="Aptos" w:hAnsi="Aptos"/>
+                <w:lang w:val="es-CO"/>
+              </w:rPr>
+            </w:pPr>
+            <w:r/>
+          </w:p>
+        </w:tc>
+        <w:tc>
+          <w:tcPr>
+            <w:tcW w:w="2340" w:type="dxa"/>
+          </w:tcPr>
+          <w:p>
+            <w:pPr>
+              <w:jc w:val="center"/>
+              <w:rPr>
+                <w:rFonts w:ascii="Aptos" w:hAnsi="Aptos"/>
+                <w:lang w:val="es-CO"/>
+              </w:rPr>
+            </w:pPr>
+            <w:r/>
+          </w:p>
+        </w:tc>
+        <w:tc>
+          <w:tcPr>
+            <w:tcW w:w="2340" w:type="dxa"/>
+          </w:tcPr>
+          <w:p>
+            <w:pPr>
+              <w:jc w:val="center"/>
+              <w:rPr>
+                <w:rFonts w:ascii="Aptos" w:hAnsi="Aptos"/>
+                <w:lang w:val="es-CO"/>
+              </w:rPr>
+            </w:pPr>
+            <w:r/>
           </w:p>
         </w:tc>
       </w:tr>

</xml_diff>